<commit_message>
Fix Q16: 反問→激問, correct answer D→C
</commit_message>
<xml_diff>
--- a/古文今讀21-25.docx
+++ b/古文今讀21-25.docx
@@ -2754,7 +2754,7 @@
         <w:t xml:space="preserve">（　　）16. </w:t>
       </w:r>
       <w:r>
-        <w:t>下列文句所表現的語氣，何者是「反問」？</w:t>
+        <w:t>下列文句所表現的語氣，何者是「激問」？</w:t>
       </w:r>
     </w:p>
     <w:p>
@@ -3948,7 +3948,7 @@
           </w:tcPr>
           <w:p>
             <w:r>
-              <w:t>D</w:t>
+              <w:t>C</w:t>
             </w:r>
           </w:p>
         </w:tc>
@@ -3958,7 +3958,7 @@
           </w:tcPr>
           <w:p>
             <w:r>
-              <w:t>「安有為人臣而戲其君乎」用反問語氣，強調自己絕不敢戲弄君主。</w:t>
+              <w:t>「安有為人臣而戲其君乎」用激問語氣，答案在問題的反面，藉此強調自己絕不敢戲弄君主。</w:t>
             </w:r>
           </w:p>
         </w:tc>

</xml_diff>

<commit_message>
Add environment-influence idioms to Lesson 22 (近朱者赤近墨者黑, 孟母三遷, 橘化為枳, 里仁為美, 耳濡目染, 潛移默化) + matching quiz question
</commit_message>
<xml_diff>
--- a/古文今讀21-25.docx
+++ b/古文今讀21-25.docx
@@ -1260,7 +1260,16 @@
           <w:b w:val="0"/>
           <w:sz w:val="22"/>
         </w:rPr>
-        <w:t>補充（墨子・所染）：蓬生麻中，不扶而直；白沙在涅，與之俱黑。入鮑魚之肆，久而不聞其臭；入芝蘭之室，久而不聞其香。染於蒼則蒼，染於黃則黃——比喻人的習性會因環境影響而改變，近朱者赤，近墨者黑。</w:t>
+        <w:t>補充（墨子・所染）：蓬生麻中，不扶而直；白沙在涅，與之俱黑。入鮑魚之肆，久而不聞其臭；入芝蘭之室，久而不聞其香。染於蒼則蒼，染於黃則黃——比喻人的習性會因環境影響而改變。</w:t>
+      </w:r>
+    </w:p>
+    <w:p>
+      <w:r>
+        <w:rPr>
+          <w:b w:val="0"/>
+          <w:sz w:val="22"/>
+        </w:rPr>
+        <w:t>成語補充「環境對人的影響」：近朱者赤，近墨者黑（接近好人使人變好，接近壞人使人變壞）、孟母三遷（比喻父母用心良苦，重視孩子成長的環境）、橘化為枳／南橘北枳（同一事物因環境不同而發生改變）、里仁為美（居住在仁厚風氣的地方最好，強調選擇居住環境的重要）、耳濡目染（長期處在某種環境中，不知不覺受到影響）、潛移默化（在不知不覺中，思想、性格逐漸受到感染而改變）。</w:t>
       </w:r>
     </w:p>
     <w:p>
@@ -2875,6 +2884,25 @@
     </w:p>
     <w:p>
       <w:r>
+        <w:rPr>
+          <w:b w:val="0"/>
+        </w:rPr>
+        <w:t xml:space="preserve">（　　）22. </w:t>
+      </w:r>
+      <w:r>
+        <w:t>「蓬生麻中，不扶而直；白沙在涅，與之俱黑」這段話，與下列哪一個成語最能表現「環境對人的影響」？</w:t>
+      </w:r>
+    </w:p>
+    <w:p>
+      <w:pPr>
+        <w:ind w:left="454"/>
+      </w:pPr>
+      <w:r>
+        <w:t>(A) 近朱者赤，近墨者黑　　(B) 水落石出　　(C) 畫蛇添足　　(D) 刻舟求劍</w:t>
+      </w:r>
+    </w:p>
+    <w:p>
+      <w:r>
         <w:br w:type="page"/>
       </w:r>
     </w:p>
@@ -4203,6 +4231,38 @@
           </w:p>
         </w:tc>
       </w:tr>
+      <w:tr>
+        <w:tc>
+          <w:tcPr>
+            <w:tcW w:type="dxa" w:w="1134"/>
+          </w:tcPr>
+          <w:p>
+            <w:r>
+              <w:t>22</w:t>
+            </w:r>
+          </w:p>
+        </w:tc>
+        <w:tc>
+          <w:tcPr>
+            <w:tcW w:type="dxa" w:w="1134"/>
+          </w:tcPr>
+          <w:p>
+            <w:r>
+              <w:t>A</w:t>
+            </w:r>
+          </w:p>
+        </w:tc>
+        <w:tc>
+          <w:tcPr>
+            <w:tcW w:type="dxa" w:w="7370"/>
+          </w:tcPr>
+          <w:p>
+            <w:r>
+              <w:t>蓬草生長在麻中會自然挺直，白沙混入黑泥也會變黑，正說明環境對人潛移默化的影響，意近「近朱者赤，近墨者黑」。</w:t>
+            </w:r>
+          </w:p>
+        </w:tc>
+      </w:tr>
     </w:tbl>
     <w:p/>
     <w:p>

</xml_diff>

<commit_message>
Lesson 25: last question now tests the idiom 齊人攫金 itself, with definition added to notes
</commit_message>
<xml_diff>
--- a/古文今讀21-25.docx
+++ b/古文今讀21-25.docx
@@ -1989,6 +1989,15 @@
       </w:r>
     </w:p>
     <w:p>
+      <w:r>
+        <w:rPr>
+          <w:b w:val="0"/>
+          <w:sz w:val="22"/>
+        </w:rPr>
+        <w:t>成語「齊人攫金」：比喻一心貪圖財利，見利而不見其他，因利慾薰心而不顧一切、不擇手段的人。</w:t>
+      </w:r>
+    </w:p>
+    <w:p>
       <w:pPr>
         <w:spacing w:before="240" w:after="120"/>
       </w:pPr>
@@ -3372,7 +3381,7 @@
         <w:t xml:space="preserve">（　　）4. </w:t>
       </w:r>
       <w:r>
-        <w:t>「吏捕得之」的「之」是指？</w:t>
+        <w:t>後人以「齊人攫金」比喻什麼樣的人？</w:t>
       </w:r>
     </w:p>
     <w:p>
@@ -3380,7 +3389,7 @@
         <w:ind w:left="454"/>
       </w:pPr>
       <w:r>
-        <w:t>(A) 搶奪金子的齊人　　(B) 賣金子的商人　　(C) 圍觀的市集群眾　　(D) 巡邏的官吏</w:t>
+        <w:t>(A) 一心貪圖財利，見利而不見其他，因利慾薰心而不顧一切、不擇手段的人　　(B) 誠實可靠，堂堂正正做事的人　　(C) 行事謹慎，瞻前顧後的人　　(D) 喜歡在市集閒逛購物的人</w:t>
       </w:r>
     </w:p>
     <w:p>
@@ -4978,7 +4987,7 @@
           </w:tcPr>
           <w:p>
             <w:r>
-              <w:t>巡吏逮捕的對象，是那個伸手搶奪金子後逃跑的齊人。</w:t>
+              <w:t>「齊人攫金」比喻一心只想得到財利，見利而不見其他，因利慾薰心而不顧一切、不擇手段的人。</w:t>
             </w:r>
           </w:p>
         </w:tc>

</xml_diff>

<commit_message>
Lesson 21 Q4: explain all four meanings of 應; Lesson 22: add 重點提示 idiom box (欬唾成珠/目不見睫/利令智昏/玩物喪志/鼠目寸光/鋌而走險), moved from Lesson 25
</commit_message>
<xml_diff>
--- a/古文今讀21-25.docx
+++ b/古文今讀21-25.docx
@@ -1283,6 +1283,213 @@
     </w:p>
     <w:p>
       <w:pPr>
+        <w:spacing w:before="120"/>
+      </w:pPr>
+      <w:r>
+        <w:rPr>
+          <w:b/>
+          <w:color w:val="C00000"/>
+        </w:rPr>
+        <w:t>重點提示｜成語</w:t>
+      </w:r>
+    </w:p>
+    <w:tbl>
+      <w:tblPr>
+        <w:tblStyle w:val="TableGrid"/>
+        <w:tblW w:type="auto" w:w="0"/>
+        <w:jc w:val="center"/>
+        <w:tblLook w:firstColumn="1" w:firstRow="1" w:lastColumn="0" w:lastRow="0" w:noHBand="0" w:noVBand="1" w:val="04A0"/>
+      </w:tblPr>
+      <w:tblGrid>
+        <w:gridCol w:w="4320"/>
+        <w:gridCol w:w="4320"/>
+      </w:tblGrid>
+      <w:tr>
+        <w:tc>
+          <w:tcPr>
+            <w:tcW w:type="dxa" w:w="2268"/>
+            <w:shd w:val="clear" w:color="auto" w:fill="E2EFDA"/>
+            <w:shd w:val="clear" w:color="auto" w:fill="FCE4D6"/>
+          </w:tcPr>
+          <w:p>
+            <w:pPr>
+              <w:jc w:val="center"/>
+            </w:pPr>
+            <w:r>
+              <w:rPr>
+                <w:b/>
+              </w:rPr>
+              <w:t>成語</w:t>
+            </w:r>
+          </w:p>
+        </w:tc>
+        <w:tc>
+          <w:tcPr>
+            <w:tcW w:type="dxa" w:w="6803"/>
+            <w:shd w:val="clear" w:color="auto" w:fill="E2EFDA"/>
+            <w:shd w:val="clear" w:color="auto" w:fill="FCE4D6"/>
+          </w:tcPr>
+          <w:p>
+            <w:pPr>
+              <w:jc w:val="center"/>
+            </w:pPr>
+            <w:r>
+              <w:rPr>
+                <w:b/>
+              </w:rPr>
+              <w:t>解釋</w:t>
+            </w:r>
+          </w:p>
+        </w:tc>
+      </w:tr>
+      <w:tr>
+        <w:tc>
+          <w:tcPr>
+            <w:tcW w:type="dxa" w:w="2268"/>
+            <w:shd w:val="clear" w:color="auto" w:fill="FCE4D6"/>
+          </w:tcPr>
+          <w:p>
+            <w:r>
+              <w:t>欬唾成珠（ㄎㄞˋ）</w:t>
+            </w:r>
+          </w:p>
+        </w:tc>
+        <w:tc>
+          <w:tcPr>
+            <w:tcW w:type="dxa" w:w="6803"/>
+            <w:shd w:val="clear" w:color="auto" w:fill="FCE4D6"/>
+          </w:tcPr>
+          <w:p>
+            <w:r>
+              <w:t>比喻言談不凡或文詞優美。</w:t>
+            </w:r>
+          </w:p>
+        </w:tc>
+      </w:tr>
+      <w:tr>
+        <w:tc>
+          <w:tcPr>
+            <w:tcW w:type="dxa" w:w="2268"/>
+            <w:shd w:val="clear" w:color="auto" w:fill="FCE4D6"/>
+          </w:tcPr>
+          <w:p>
+            <w:r>
+              <w:t>目不見睫</w:t>
+            </w:r>
+          </w:p>
+        </w:tc>
+        <w:tc>
+          <w:tcPr>
+            <w:tcW w:type="dxa" w:w="6803"/>
+            <w:shd w:val="clear" w:color="auto" w:fill="FCE4D6"/>
+          </w:tcPr>
+          <w:p>
+            <w:r>
+              <w:t>比喻人無自知之明，不能看見自己的過失。</w:t>
+            </w:r>
+          </w:p>
+        </w:tc>
+      </w:tr>
+      <w:tr>
+        <w:tc>
+          <w:tcPr>
+            <w:tcW w:type="dxa" w:w="2268"/>
+            <w:shd w:val="clear" w:color="auto" w:fill="FCE4D6"/>
+          </w:tcPr>
+          <w:p>
+            <w:r>
+              <w:t>利令智昏</w:t>
+            </w:r>
+          </w:p>
+        </w:tc>
+        <w:tc>
+          <w:tcPr>
+            <w:tcW w:type="dxa" w:w="6803"/>
+            <w:shd w:val="clear" w:color="auto" w:fill="FCE4D6"/>
+          </w:tcPr>
+          <w:p>
+            <w:r>
+              <w:t>因貪圖財利而失去理智，做出不顧一切的事。</w:t>
+            </w:r>
+          </w:p>
+        </w:tc>
+      </w:tr>
+      <w:tr>
+        <w:tc>
+          <w:tcPr>
+            <w:tcW w:type="dxa" w:w="2268"/>
+            <w:shd w:val="clear" w:color="auto" w:fill="FCE4D6"/>
+          </w:tcPr>
+          <w:p>
+            <w:r>
+              <w:t>玩物喪志</w:t>
+            </w:r>
+          </w:p>
+        </w:tc>
+        <w:tc>
+          <w:tcPr>
+            <w:tcW w:type="dxa" w:w="6803"/>
+            <w:shd w:val="clear" w:color="auto" w:fill="FCE4D6"/>
+          </w:tcPr>
+          <w:p>
+            <w:r>
+              <w:t>一味玩賞無益的器物，因而消磨人的志向。</w:t>
+            </w:r>
+          </w:p>
+        </w:tc>
+      </w:tr>
+      <w:tr>
+        <w:tc>
+          <w:tcPr>
+            <w:tcW w:type="dxa" w:w="2268"/>
+            <w:shd w:val="clear" w:color="auto" w:fill="FCE4D6"/>
+          </w:tcPr>
+          <w:p>
+            <w:r>
+              <w:t>鼠目寸光</w:t>
+            </w:r>
+          </w:p>
+        </w:tc>
+        <w:tc>
+          <w:tcPr>
+            <w:tcW w:type="dxa" w:w="6803"/>
+            <w:shd w:val="clear" w:color="auto" w:fill="FCE4D6"/>
+          </w:tcPr>
+          <w:p>
+            <w:r>
+              <w:t>形容人目光短淺，識見狹小。</w:t>
+            </w:r>
+          </w:p>
+        </w:tc>
+      </w:tr>
+      <w:tr>
+        <w:tc>
+          <w:tcPr>
+            <w:tcW w:type="dxa" w:w="2268"/>
+            <w:shd w:val="clear" w:color="auto" w:fill="FCE4D6"/>
+          </w:tcPr>
+          <w:p>
+            <w:r>
+              <w:t>鋌而走險（ㄊㄧㄥˇ）</w:t>
+            </w:r>
+          </w:p>
+        </w:tc>
+        <w:tc>
+          <w:tcPr>
+            <w:tcW w:type="dxa" w:w="6803"/>
+            <w:shd w:val="clear" w:color="auto" w:fill="FCE4D6"/>
+          </w:tcPr>
+          <w:p>
+            <w:r>
+              <w:t>在窮途末路或受逼迫時，採取冒險行動或不正當的行為。</w:t>
+            </w:r>
+          </w:p>
+        </w:tc>
+      </w:tr>
+    </w:tbl>
+    <w:p/>
+    <w:p>
+      <w:pPr>
         <w:spacing w:before="240" w:after="120"/>
       </w:pPr>
       <w:r>
@@ -1968,15 +2175,6 @@
           <w:sz w:val="22"/>
         </w:rPr>
         <w:t>原文：昔齊人有欲金者，清旦，衣冠而之市，適鬻金者之所，因攫其金而去。吏捕得之，問曰：「人皆在焉，子攫人之金何？」對曰：「取金之時，不見人，徒見金。」</w:t>
-      </w:r>
-    </w:p>
-    <w:p>
-      <w:r>
-        <w:rPr>
-          <w:b w:val="0"/>
-          <w:sz w:val="22"/>
-        </w:rPr>
-        <w:t>補充成語：目不見睫（比喻人無自知之明，不能看見自己的過失）、玩物喪志（一味玩賞無益的器物，因而消磨人的志向）、鼠目寸光（形容人目光短淺，識見狹小）、利慾薰心（被利慾迷惑，使得理智昏亂）、鋌而走險（在窮途末路或受逼迫時，採取冒險行動或不正當的行為）。</w:t>
       </w:r>
     </w:p>
     <w:p>
@@ -4475,7 +4673,7 @@
           </w:tcPr>
           <w:p>
             <w:r>
-              <w:t>應：回答。楚人被質問後，答不出話來。</w:t>
+              <w:t>「應」字依語境有多種意思：(A)回答——本文「其人弗能應也」即指楚人答不出話來，為正確答案。(B)對付、因應——如「隨機應變」的「應」。(C)適合、相稱——如「得心應手」「應景」的「應」。(D)附和、呼應——如「一唱一應」「裡應外合」的「應」。</w:t>
             </w:r>
           </w:p>
         </w:tc>

</xml_diff>